<commit_message>
Sync from private source SHA: a8465aa393ee208fde2178ca554c98fc07bfcf0a
</commit_message>
<xml_diff>
--- a/Docs/01Foundation/Outlier.docx
+++ b/Docs/01Foundation/Outlier.docx
@@ -27,6 +27,8 @@
           <w:lang w:val="en-US"/>
         </w:rPr>
       </w:pPr>
+      <w:bookmarkStart w:id="0" w:name="_GoBack"/>
+      <w:bookmarkEnd w:id="0"/>
       <w:r>
         <w:rPr>
           <w:rFonts w:hint="default" w:asciiTheme="minorEastAsia" w:hAnsiTheme="minorEastAsia" w:cstheme="minorEastAsia"/>
@@ -152,6 +154,7 @@
     </w:p>
     <w:tbl>
       <w:tblPr>
+        <w:tblStyle w:val="2"/>
         <w:tblW w:w="4998" w:type="pct"/>
         <w:tblInd w:w="0" w:type="dxa"/>
         <w:tblBorders>
@@ -162,7 +165,7 @@
           <w:insideH w:val="none" w:color="auto" w:sz="0" w:space="0"/>
           <w:insideV w:val="none" w:color="auto" w:sz="0" w:space="0"/>
         </w:tblBorders>
-        <w:shd w:val="clear"/>
+        <w:shd w:val="clear" w:color="auto" w:fill="auto"/>
         <w:tblLayout w:type="autofit"/>
         <w:tblCellMar>
           <w:top w:w="0" w:type="dxa"/>
@@ -239,7 +242,6 @@
                 <w:sz w:val="21"/>
                 <w:szCs w:val="21"/>
                 <w:u w:val="none"/>
-                <w:bdr w:val="none" w:color="auto" w:sz="0" w:space="0"/>
                 <w:lang w:val="en-US" w:eastAsia="zh-CN" w:bidi="ar"/>
               </w:rPr>
               <w:t>n</w:t>
@@ -300,7 +302,6 @@
                 <w:sz w:val="21"/>
                 <w:szCs w:val="21"/>
                 <w:u w:val="none"/>
-                <w:bdr w:val="none" w:color="auto" w:sz="0" w:space="0"/>
                 <w:lang w:val="en-US" w:eastAsia="zh-CN" w:bidi="ar"/>
               </w:rPr>
               <w:t>Min</w:t>
@@ -340,7 +341,7 @@
               <w:jc w:val="center"/>
               <w:textAlignment w:val="center"/>
               <w:rPr>
-                <w:rFonts w:hint="eastAsia" w:asciiTheme="minorEastAsia" w:hAnsiTheme="minorEastAsia" w:eastAsiaTheme="minorEastAsia" w:cstheme="minorEastAsia"/>
+                <w:rFonts w:hint="default" w:asciiTheme="minorEastAsia" w:hAnsiTheme="minorEastAsia" w:eastAsiaTheme="minorEastAsia" w:cstheme="minorEastAsia"/>
                 <w:b w:val="0"/>
                 <w:i/>
                 <w:iCs/>
@@ -348,6 +349,7 @@
                 <w:sz w:val="21"/>
                 <w:szCs w:val="21"/>
                 <w:u w:val="none"/>
+                <w:lang w:val="en-US"/>
               </w:rPr>
             </w:pPr>
             <w:r>
@@ -361,10 +363,25 @@
                 <w:sz w:val="21"/>
                 <w:szCs w:val="21"/>
                 <w:u w:val="none"/>
-                <w:bdr w:val="none" w:color="auto" w:sz="0" w:space="0"/>
                 <w:lang w:val="en-US" w:eastAsia="zh-CN" w:bidi="ar"/>
               </w:rPr>
-              <w:t>Q1</w:t>
+              <w:t>Q</w:t>
+            </w:r>
+            <w:r>
+              <w:rPr>
+                <w:rFonts w:hint="default" w:asciiTheme="minorEastAsia" w:hAnsiTheme="minorEastAsia" w:cstheme="minorEastAsia"/>
+                <w:b w:val="0"/>
+                <w:i/>
+                <w:iCs/>
+                <w:color w:val="000000"/>
+                <w:kern w:val="0"/>
+                <w:sz w:val="21"/>
+                <w:szCs w:val="21"/>
+                <w:u w:val="none"/>
+                <w:vertAlign w:val="subscript"/>
+                <w:lang w:val="en-US" w:eastAsia="zh-CN" w:bidi="ar"/>
+              </w:rPr>
+              <w:t>1</w:t>
             </w:r>
           </w:p>
         </w:tc>
@@ -422,7 +439,6 @@
                 <w:sz w:val="21"/>
                 <w:szCs w:val="21"/>
                 <w:u w:val="none"/>
-                <w:bdr w:val="none" w:color="auto" w:sz="0" w:space="0"/>
                 <w:lang w:val="en-US" w:eastAsia="zh-CN" w:bidi="ar"/>
               </w:rPr>
               <w:t>Mdn</w:t>
@@ -483,10 +499,25 @@
                 <w:sz w:val="21"/>
                 <w:szCs w:val="21"/>
                 <w:u w:val="none"/>
-                <w:bdr w:val="none" w:color="auto" w:sz="0" w:space="0"/>
                 <w:lang w:val="en-US" w:eastAsia="zh-CN" w:bidi="ar"/>
               </w:rPr>
-              <w:t>Q3</w:t>
+              <w:t>Q</w:t>
+            </w:r>
+            <w:r>
+              <w:rPr>
+                <w:rFonts w:hint="eastAsia" w:asciiTheme="minorEastAsia" w:hAnsiTheme="minorEastAsia" w:eastAsiaTheme="minorEastAsia" w:cstheme="minorEastAsia"/>
+                <w:b w:val="0"/>
+                <w:i/>
+                <w:iCs/>
+                <w:color w:val="000000"/>
+                <w:kern w:val="0"/>
+                <w:sz w:val="21"/>
+                <w:szCs w:val="21"/>
+                <w:u w:val="none"/>
+                <w:vertAlign w:val="subscript"/>
+                <w:lang w:val="en-US" w:eastAsia="zh-CN" w:bidi="ar"/>
+              </w:rPr>
+              <w:t>3</w:t>
             </w:r>
           </w:p>
         </w:tc>
@@ -544,7 +575,6 @@
                 <w:sz w:val="21"/>
                 <w:szCs w:val="21"/>
                 <w:u w:val="none"/>
-                <w:bdr w:val="none" w:color="auto" w:sz="0" w:space="0"/>
                 <w:lang w:val="en-US" w:eastAsia="zh-CN" w:bidi="ar"/>
               </w:rPr>
               <w:t>Max</w:t>
@@ -605,7 +635,6 @@
                 <w:sz w:val="21"/>
                 <w:szCs w:val="21"/>
                 <w:u w:val="none"/>
-                <w:bdr w:val="none" w:color="auto" w:sz="0" w:space="0"/>
                 <w:lang w:val="en-US" w:eastAsia="zh-CN" w:bidi="ar"/>
               </w:rPr>
               <w:t>IQR</w:t>
@@ -671,7 +700,6 @@
                 <w:sz w:val="21"/>
                 <w:szCs w:val="21"/>
                 <w:u w:val="none"/>
-                <w:bdr w:val="none" w:color="auto" w:sz="0" w:space="0"/>
                 <w:lang w:val="en-US" w:eastAsia="zh-CN" w:bidi="ar"/>
               </w:rPr>
               <w:t>100</w:t>
@@ -732,7 +760,6 @@
                 <w:sz w:val="21"/>
                 <w:szCs w:val="21"/>
                 <w:u w:val="none"/>
-                <w:bdr w:val="none" w:color="auto" w:sz="0" w:space="0"/>
                 <w:lang w:val="en-US" w:eastAsia="zh-CN" w:bidi="ar"/>
               </w:rPr>
               <w:t>66</w:t>
@@ -793,7 +820,6 @@
                 <w:sz w:val="21"/>
                 <w:szCs w:val="21"/>
                 <w:u w:val="none"/>
-                <w:bdr w:val="none" w:color="auto" w:sz="0" w:space="0"/>
                 <w:lang w:val="en-US" w:eastAsia="zh-CN" w:bidi="ar"/>
               </w:rPr>
               <w:t>69</w:t>
@@ -854,7 +880,6 @@
                 <w:sz w:val="21"/>
                 <w:szCs w:val="21"/>
                 <w:u w:val="none"/>
-                <w:bdr w:val="none" w:color="auto" w:sz="0" w:space="0"/>
                 <w:lang w:val="en-US" w:eastAsia="zh-CN" w:bidi="ar"/>
               </w:rPr>
               <w:t>71.5</w:t>
@@ -915,7 +940,6 @@
                 <w:sz w:val="21"/>
                 <w:szCs w:val="21"/>
                 <w:u w:val="none"/>
-                <w:bdr w:val="none" w:color="auto" w:sz="0" w:space="0"/>
                 <w:lang w:val="en-US" w:eastAsia="zh-CN" w:bidi="ar"/>
               </w:rPr>
               <w:t>74</w:t>
@@ -976,7 +1000,6 @@
                 <w:sz w:val="21"/>
                 <w:szCs w:val="21"/>
                 <w:u w:val="none"/>
-                <w:bdr w:val="none" w:color="auto" w:sz="0" w:space="0"/>
                 <w:lang w:val="en-US" w:eastAsia="zh-CN" w:bidi="ar"/>
               </w:rPr>
               <w:t>91</w:t>
@@ -1037,7 +1060,6 @@
                 <w:sz w:val="21"/>
                 <w:szCs w:val="21"/>
                 <w:u w:val="none"/>
-                <w:bdr w:val="none" w:color="auto" w:sz="0" w:space="0"/>
                 <w:lang w:val="en-US" w:eastAsia="zh-CN" w:bidi="ar"/>
               </w:rPr>
               <w:t>5</w:t>
@@ -1094,8 +1116,6 @@
         </w:rPr>
         <w:t>. The data were sourced from the SPSS built-in dataset adl.sav.</w:t>
       </w:r>
-      <w:bookmarkStart w:id="0" w:name="_GoBack"/>
-      <w:bookmarkEnd w:id="0"/>
     </w:p>
     <w:p>
       <w:pPr>

</xml_diff>